<commit_message>
Thêm chức năng admin
</commit_message>
<xml_diff>
--- a/docs/tai_lieu_ky_thuat_he_thong.docx
+++ b/docs/tai_lieu_ky_thuat_he_thong.docx
@@ -402,6 +402,92 @@
           </w:p>
         </w:tc>
       </w:tr>
+      <w:tr>
+        <w:trPr>
+          <w:cnfStyle w:val="000000100000" w:firstRow="0" w:lastRow="0" w:firstColumn="0" w:lastColumn="0" w:oddVBand="0" w:evenVBand="0" w:oddHBand="1" w:evenHBand="0" w:firstRowFirstColumn="0" w:firstRowLastColumn="0" w:lastRowFirstColumn="0" w:lastRowLastColumn="0"/>
+          <w:jc w:val="center"/>
+        </w:trPr>
+        <w:tc>
+          <w:tcPr>
+            <w:cnfStyle w:val="001000000000" w:firstRow="0" w:lastRow="0" w:firstColumn="1" w:lastColumn="0" w:oddVBand="0" w:evenVBand="0" w:oddHBand="0" w:evenHBand="0" w:firstRowFirstColumn="0" w:firstRowLastColumn="0" w:lastRowFirstColumn="0" w:lastRowLastColumn="0"/>
+            <w:tcW w:w="2376" w:type="dxa"/>
+          </w:tcPr>
+          <w:p>
+            <w:r>
+              <w:t>Firebase Admin SDK</w:t>
+            </w:r>
+          </w:p>
+        </w:tc>
+        <w:tc>
+          <w:tcPr>
+            <w:tcW w:w="2110" w:type="dxa"/>
+          </w:tcPr>
+          <w:p>
+            <w:pPr>
+              <w:cnfStyle w:val="000000100000" w:firstRow="0" w:lastRow="0" w:firstColumn="0" w:lastColumn="0" w:oddVBand="0" w:evenVBand="0" w:oddHBand="1" w:evenHBand="0" w:firstRowFirstColumn="0" w:firstRowLastColumn="0" w:lastRowFirstColumn="0" w:lastRowLastColumn="0"/>
+            </w:pPr>
+            <w:r>
+              <w:t>7.4.0</w:t>
+            </w:r>
+          </w:p>
+        </w:tc>
+        <w:tc>
+          <w:tcPr>
+            <w:tcW w:w="4370" w:type="dxa"/>
+          </w:tcPr>
+          <w:p>
+            <w:pPr>
+              <w:cnfStyle w:val="000000100000" w:firstRow="0" w:lastRow="0" w:firstColumn="0" w:lastColumn="0" w:oddVBand="0" w:evenVBand="0" w:oddHBand="1" w:evenHBand="0" w:firstRowFirstColumn="0" w:firstRowLastColumn="0" w:lastRowFirstColumn="0" w:lastRowLastColumn="0"/>
+            </w:pPr>
+            <w:r>
+              <w:t>Kết nối ứng dụng với Firebase Firestore (CSDL Cloud thời gian thực) và Firebase Auth (Xác thực quản trị viên).</w:t>
+            </w:r>
+          </w:p>
+        </w:tc>
+      </w:tr>
+      <w:tr>
+        <w:trPr>
+          <w:cnfStyle w:val="000000010000" w:firstRow="0" w:lastRow="0" w:firstColumn="0" w:lastColumn="0" w:oddVBand="0" w:evenVBand="0" w:oddHBand="0" w:evenHBand="1" w:firstRowFirstColumn="0" w:firstRowLastColumn="0" w:lastRowFirstColumn="0" w:lastRowLastColumn="0"/>
+          <w:jc w:val="center"/>
+        </w:trPr>
+        <w:tc>
+          <w:tcPr>
+            <w:cnfStyle w:val="001000000000" w:firstRow="0" w:lastRow="0" w:firstColumn="1" w:lastColumn="0" w:oddVBand="0" w:evenVBand="0" w:oddHBand="0" w:evenHBand="0" w:firstRowFirstColumn="0" w:firstRowLastColumn="0" w:lastRowFirstColumn="0" w:lastRowLastColumn="0"/>
+            <w:tcW w:w="2376" w:type="dxa"/>
+          </w:tcPr>
+          <w:p>
+            <w:r>
+              <w:t>Requests</w:t>
+            </w:r>
+          </w:p>
+        </w:tc>
+        <w:tc>
+          <w:tcPr>
+            <w:tcW w:w="2110" w:type="dxa"/>
+          </w:tcPr>
+          <w:p>
+            <w:pPr>
+              <w:cnfStyle w:val="000000010000" w:firstRow="0" w:lastRow="0" w:firstColumn="0" w:lastColumn="0" w:oddVBand="0" w:evenVBand="0" w:oddHBand="0" w:evenHBand="1" w:firstRowFirstColumn="0" w:firstRowLastColumn="0" w:lastRowFirstColumn="0" w:lastRowLastColumn="0"/>
+            </w:pPr>
+            <w:r>
+              <w:t>2.32+</w:t>
+            </w:r>
+          </w:p>
+        </w:tc>
+        <w:tc>
+          <w:tcPr>
+            <w:tcW w:w="4370" w:type="dxa"/>
+          </w:tcPr>
+          <w:p>
+            <w:pPr>
+              <w:cnfStyle w:val="000000010000" w:firstRow="0" w:lastRow="0" w:firstColumn="0" w:lastColumn="0" w:oddVBand="0" w:evenVBand="0" w:oddHBand="0" w:evenHBand="1" w:firstRowFirstColumn="0" w:firstRowLastColumn="0" w:lastRowFirstColumn="0" w:lastRowLastColumn="0"/>
+            </w:pPr>
+            <w:r>
+              <w:t>Thư viện HTTP dùng để gọi Firebase Auth REST API cho việc xác thực đăng nhập Email/Password của Admin.</w:t>
+            </w:r>
+          </w:p>
+        </w:tc>
+      </w:tr>
     </w:tbl>
     <w:p>
       <w:pPr>
@@ -710,7 +796,15 @@
                 <w:rFonts w:cs="Times New Roman"/>
                 <w:szCs w:val="26"/>
               </w:rPr>
-              <w:t>Thư viện Machine Learning cốt lõi, cung cấp các thuật toán phân lớp (RF, DT, SVM), tiền xử lý dữ liệu (StandardScaler, OneHotEncoder), tối ưu siêu tham số (GridSearchCV) và đánh giá mô hình.</w:t>
+              <w:t xml:space="preserve">Thư viện Machine Learning cốt lõi, cung cấp các thuật toán phân </w:t>
+            </w:r>
+            <w:r>
+              <w:rPr>
+                <w:rFonts w:cs="Times New Roman"/>
+                <w:szCs w:val="26"/>
+              </w:rPr>
+              <w:lastRenderedPageBreak/>
+              <w:t>lớp (RF, DT, SVM), tiền xử lý dữ liệu (StandardScaler, OneHotEncoder), tối ưu siêu tham số (GridSearchCV) và đánh giá mô hình.</w:t>
             </w:r>
           </w:p>
         </w:tc>
@@ -1062,11 +1156,7 @@
         </w:rPr>
       </w:pPr>
       <w:r>
-        <w:rPr>
-          <w:rFonts w:cs="Times New Roman"/>
-          <w:szCs w:val="26"/>
-        </w:rPr>
-        <w:t>• Xác thực Admin qua URL ẩn: Người quản trị truy cập trang đăng nhập bằng tham số URL bí mật (?admin=true), hoàn toàn vô hình với người dùng cuối.</w:t>
+        <w:t>• Xác thực Admin qua Firebase Authentication: Người quản trị đăng nhập bằng Email/Password thông qua hệ thống Firebase Auth chính thức của Google. Mã xác thực được gửi qua REST API tới máy chủ Firebase để đảm bảo tính bảo mật tuyệt đối, thay thế hoàn toàn phương pháp so sánh mã băm cục bộ trước đây.</w:t>
       </w:r>
     </w:p>
     <w:p>
@@ -1077,11 +1167,7 @@
         </w:rPr>
       </w:pPr>
       <w:r>
-        <w:rPr>
-          <w:rFonts w:cs="Times New Roman"/>
-          <w:szCs w:val="26"/>
-        </w:rPr>
-        <w:t>• Mã hóa Mật khẩu SHA-256: Mật khẩu Admin được lưu trữ dưới dạng mã băm một chiều (SHA-256 Hash) trong file .streamlit/secrets.toml, đảm bảo không thể bị đọc ngược ngay cả khi mã nguồn bị lộ.</w:t>
+        <w:t>• Lưu trữ thông tin nhạy cảm qua Streamlit Secrets: Toàn bộ mã khóa Firebase (API Key, Service Account Private Key) được bảo quản trong file .streamlit/secrets.toml — một cơ chế bảo mật tiêu chuẩn của Streamlit, được Git Ignored để không bị lộ khi đẩy mã nguồn lên GitHub.</w:t>
       </w:r>
     </w:p>
     <w:p>
@@ -1092,11 +1178,11 @@
         </w:rPr>
       </w:pPr>
       <w:r>
-        <w:rPr>
-          <w:rFonts w:cs="Times New Roman"/>
-          <w:szCs w:val="26"/>
-        </w:rPr>
-        <w:t>• Dashboard Quản trị tách biệt: Toàn bộ chức năng quản lý (CRUD câu hỏi MBTI, Upload hình ảnh, Thống kê lượt sử dụng, XAI) được gói gọn trong một module riêng biệt, không ảnh hưởng đến trải nghiệm người dùng.</w:t>
+        <w:t xml:space="preserve">• Dashboard Quản trị tách biệt: Toàn bộ chức năng quản lý (CRUD câu hỏi MBTI, Upload hình ảnh, Thống kê lượt sử dụng, XAI) được gói gọn trong module riêng </w:t>
+      </w:r>
+      <w:r>
+        <w:lastRenderedPageBreak/>
+        <w:t>biệt. Mọi thay đổi trên Dashboard sẽ được đồng bộ ngay lập tức lên Firebase Firestore và tự động cập nhật cho người dùng cuối thông qua cơ chế Cache TTL.</w:t>
       </w:r>
     </w:p>
     <w:p>
@@ -2482,15 +2568,15 @@
     <w:tbl>
       <w:tblPr>
         <w:tblStyle w:val="LightGrid-Accent1"/>
-        <w:tblW w:w="0" w:type="auto"/>
+        <w:tblW w:w="9464" w:type="dxa"/>
         <w:jc w:val="center"/>
         <w:tblLook w:val="04A0" w:firstRow="1" w:lastRow="0" w:firstColumn="1" w:lastColumn="0" w:noHBand="0" w:noVBand="1"/>
       </w:tblPr>
       <w:tblGrid>
-        <w:gridCol w:w="703"/>
-        <w:gridCol w:w="2035"/>
-        <w:gridCol w:w="1219"/>
-        <w:gridCol w:w="4899"/>
+        <w:gridCol w:w="708"/>
+        <w:gridCol w:w="2050"/>
+        <w:gridCol w:w="1227"/>
+        <w:gridCol w:w="5479"/>
       </w:tblGrid>
       <w:tr>
         <w:trPr>
@@ -2500,7 +2586,7 @@
         <w:tc>
           <w:tcPr>
             <w:cnfStyle w:val="001000000000" w:firstRow="0" w:lastRow="0" w:firstColumn="1" w:lastColumn="0" w:oddVBand="0" w:evenVBand="0" w:oddHBand="0" w:evenHBand="0" w:firstRowFirstColumn="0" w:firstRowLastColumn="0" w:lastRowFirstColumn="0" w:lastRowLastColumn="0"/>
-            <w:tcW w:w="2160" w:type="dxa"/>
+            <w:tcW w:w="703" w:type="dxa"/>
           </w:tcPr>
           <w:p>
             <w:pPr>
@@ -2520,7 +2606,7 @@
         </w:tc>
         <w:tc>
           <w:tcPr>
-            <w:tcW w:w="2160" w:type="dxa"/>
+            <w:tcW w:w="2035" w:type="dxa"/>
           </w:tcPr>
           <w:p>
             <w:pPr>
@@ -2541,7 +2627,7 @@
         </w:tc>
         <w:tc>
           <w:tcPr>
-            <w:tcW w:w="2160" w:type="dxa"/>
+            <w:tcW w:w="1219" w:type="dxa"/>
           </w:tcPr>
           <w:p>
             <w:pPr>
@@ -2562,7 +2648,7 @@
         </w:tc>
         <w:tc>
           <w:tcPr>
-            <w:tcW w:w="2160" w:type="dxa"/>
+            <w:tcW w:w="5507" w:type="dxa"/>
           </w:tcPr>
           <w:p>
             <w:pPr>
@@ -2590,7 +2676,7 @@
         <w:tc>
           <w:tcPr>
             <w:cnfStyle w:val="001000000000" w:firstRow="0" w:lastRow="0" w:firstColumn="1" w:lastColumn="0" w:oddVBand="0" w:evenVBand="0" w:oddHBand="0" w:evenHBand="0" w:firstRowFirstColumn="0" w:firstRowLastColumn="0" w:lastRowFirstColumn="0" w:lastRowLastColumn="0"/>
-            <w:tcW w:w="2160" w:type="dxa"/>
+            <w:tcW w:w="703" w:type="dxa"/>
           </w:tcPr>
           <w:p>
             <w:pPr>
@@ -2610,7 +2696,7 @@
         </w:tc>
         <w:tc>
           <w:tcPr>
-            <w:tcW w:w="2160" w:type="dxa"/>
+            <w:tcW w:w="2035" w:type="dxa"/>
           </w:tcPr>
           <w:p>
             <w:pPr>
@@ -2631,7 +2717,7 @@
         </w:tc>
         <w:tc>
           <w:tcPr>
-            <w:tcW w:w="2160" w:type="dxa"/>
+            <w:tcW w:w="1219" w:type="dxa"/>
           </w:tcPr>
           <w:p>
             <w:pPr>
@@ -2652,7 +2738,7 @@
         </w:tc>
         <w:tc>
           <w:tcPr>
-            <w:tcW w:w="2160" w:type="dxa"/>
+            <w:tcW w:w="5507" w:type="dxa"/>
           </w:tcPr>
           <w:p>
             <w:pPr>
@@ -2680,7 +2766,7 @@
         <w:tc>
           <w:tcPr>
             <w:cnfStyle w:val="001000000000" w:firstRow="0" w:lastRow="0" w:firstColumn="1" w:lastColumn="0" w:oddVBand="0" w:evenVBand="0" w:oddHBand="0" w:evenHBand="0" w:firstRowFirstColumn="0" w:firstRowLastColumn="0" w:lastRowFirstColumn="0" w:lastRowLastColumn="0"/>
-            <w:tcW w:w="2160" w:type="dxa"/>
+            <w:tcW w:w="703" w:type="dxa"/>
           </w:tcPr>
           <w:p>
             <w:pPr>
@@ -2700,7 +2786,7 @@
         </w:tc>
         <w:tc>
           <w:tcPr>
-            <w:tcW w:w="2160" w:type="dxa"/>
+            <w:tcW w:w="2035" w:type="dxa"/>
           </w:tcPr>
           <w:p>
             <w:pPr>
@@ -2721,7 +2807,7 @@
         </w:tc>
         <w:tc>
           <w:tcPr>
-            <w:tcW w:w="2160" w:type="dxa"/>
+            <w:tcW w:w="1219" w:type="dxa"/>
           </w:tcPr>
           <w:p>
             <w:pPr>
@@ -2742,7 +2828,7 @@
         </w:tc>
         <w:tc>
           <w:tcPr>
-            <w:tcW w:w="2160" w:type="dxa"/>
+            <w:tcW w:w="5507" w:type="dxa"/>
           </w:tcPr>
           <w:p>
             <w:pPr>
@@ -2770,7 +2856,7 @@
         <w:tc>
           <w:tcPr>
             <w:cnfStyle w:val="001000000000" w:firstRow="0" w:lastRow="0" w:firstColumn="1" w:lastColumn="0" w:oddVBand="0" w:evenVBand="0" w:oddHBand="0" w:evenHBand="0" w:firstRowFirstColumn="0" w:firstRowLastColumn="0" w:lastRowFirstColumn="0" w:lastRowLastColumn="0"/>
-            <w:tcW w:w="2160" w:type="dxa"/>
+            <w:tcW w:w="703" w:type="dxa"/>
           </w:tcPr>
           <w:p>
             <w:pPr>
@@ -2790,7 +2876,7 @@
         </w:tc>
         <w:tc>
           <w:tcPr>
-            <w:tcW w:w="2160" w:type="dxa"/>
+            <w:tcW w:w="2035" w:type="dxa"/>
           </w:tcPr>
           <w:p>
             <w:pPr>
@@ -2811,7 +2897,7 @@
         </w:tc>
         <w:tc>
           <w:tcPr>
-            <w:tcW w:w="2160" w:type="dxa"/>
+            <w:tcW w:w="1219" w:type="dxa"/>
           </w:tcPr>
           <w:p>
             <w:pPr>
@@ -2832,7 +2918,7 @@
         </w:tc>
         <w:tc>
           <w:tcPr>
-            <w:tcW w:w="2160" w:type="dxa"/>
+            <w:tcW w:w="5507" w:type="dxa"/>
           </w:tcPr>
           <w:p>
             <w:pPr>
@@ -2934,7 +3020,6 @@
           <w:rFonts w:cs="Times New Roman"/>
           <w:szCs w:val="26"/>
         </w:rPr>
-        <w:lastRenderedPageBreak/>
         <w:t>Bước 3 — Huấn luyện mô hình (train_model.py): Chia tập dữ liệu theo tỷ lệ 80:20 (Train:Test) với Stratified Split để đảm bảo phân phối lớp đầu ra cân đối.</w:t>
       </w:r>
     </w:p>
@@ -2951,6 +3036,7 @@
           <w:rFonts w:ascii="Times New Roman" w:hAnsi="Times New Roman" w:cs="Times New Roman"/>
           <w:color w:val="auto"/>
         </w:rPr>
+        <w:lastRenderedPageBreak/>
         <w:t>4.3. Thông số bộ dữ liệu cuối cùng</w:t>
       </w:r>
     </w:p>
@@ -3889,17 +3975,9 @@
           <w:p>
             <w:pPr>
               <w:cnfStyle w:val="000000010000" w:firstRow="0" w:lastRow="0" w:firstColumn="0" w:lastColumn="0" w:oddVBand="0" w:evenVBand="0" w:oddHBand="0" w:evenHBand="1" w:firstRowFirstColumn="0" w:firstRowLastColumn="0" w:lastRowFirstColumn="0" w:lastRowLastColumn="0"/>
-              <w:rPr>
-                <w:rFonts w:cs="Times New Roman"/>
-                <w:szCs w:val="26"/>
-              </w:rPr>
             </w:pPr>
             <w:r>
-              <w:rPr>
-                <w:rFonts w:cs="Times New Roman"/>
-                <w:szCs w:val="26"/>
-              </w:rPr>
-              <w:t>Dashboard quản trị ẩn: Chọn thuật toán, CRUD câu hỏi MBTI, Upload ảnh, Thống kê lượt sử dụng.</w:t>
+              <w:t>Dashboard quản trị: Đăng nhập bằng Firebase Auth (Email/Password), CRUD câu hỏi MBTI, Upload hình ảnh, Thống kê lượt sử dụng. Mọi thay đổi đồng bộ real-time lên Firestore.</w:t>
             </w:r>
           </w:p>
         </w:tc>
@@ -4129,17 +4207,9 @@
           <w:p>
             <w:pPr>
               <w:cnfStyle w:val="000000100000" w:firstRow="0" w:lastRow="0" w:firstColumn="0" w:lastColumn="0" w:oddVBand="0" w:evenVBand="0" w:oddHBand="1" w:evenHBand="0" w:firstRowFirstColumn="0" w:firstRowLastColumn="0" w:lastRowFirstColumn="0" w:lastRowLastColumn="0"/>
-              <w:rPr>
-                <w:rFonts w:cs="Times New Roman"/>
-                <w:szCs w:val="26"/>
-              </w:rPr>
             </w:pPr>
             <w:r>
-              <w:rPr>
-                <w:rFonts w:cs="Times New Roman"/>
-                <w:szCs w:val="26"/>
-              </w:rPr>
-              <w:t>Cơ sở dữ liệu câu hỏi trắc nghiệm MBTI (quản lý qua Admin Dashboard).</w:t>
+              <w:t>Cơ sở dữ liệu câu hỏi trắc nghiệm MBTI (file fallback cục bộ). Dữ liệu chính hiện được quản lý tập trung trên Firebase Firestore, file JSON chỉ dùng để Auto-Seed khi Firestore trống.</w:t>
             </w:r>
           </w:p>
         </w:tc>
@@ -4187,7 +4257,15 @@
                 <w:rFonts w:cs="Times New Roman"/>
                 <w:szCs w:val="26"/>
               </w:rPr>
-              <w:t>Các file Pipeline mô hình đã huấn luyện: RF, DT, SVM, Preprocessor, Target Encoder.</w:t>
+              <w:t xml:space="preserve">Các file Pipeline mô hình đã huấn </w:t>
+            </w:r>
+            <w:r>
+              <w:rPr>
+                <w:rFonts w:cs="Times New Roman"/>
+                <w:szCs w:val="26"/>
+              </w:rPr>
+              <w:lastRenderedPageBreak/>
+              <w:t>luyện: RF, DT, SVM, Preprocessor, Target Encoder.</w:t>
             </w:r>
           </w:p>
         </w:tc>
@@ -4214,6 +4292,7 @@
                 <w:rFonts w:cs="Times New Roman"/>
                 <w:szCs w:val="26"/>
               </w:rPr>
+              <w:lastRenderedPageBreak/>
               <w:t>.streamlit/secrets.toml</w:t>
             </w:r>
           </w:p>
@@ -4225,17 +4304,39 @@
           <w:p>
             <w:pPr>
               <w:cnfStyle w:val="000000100000" w:firstRow="0" w:lastRow="0" w:firstColumn="0" w:lastColumn="0" w:oddVBand="0" w:evenVBand="0" w:oddHBand="1" w:evenHBand="0" w:firstRowFirstColumn="0" w:firstRowLastColumn="0" w:lastRowFirstColumn="0" w:lastRowLastColumn="0"/>
-              <w:rPr>
-                <w:rFonts w:cs="Times New Roman"/>
-                <w:szCs w:val="26"/>
-              </w:rPr>
             </w:pPr>
             <w:r>
-              <w:rPr>
-                <w:rFonts w:cs="Times New Roman"/>
-                <w:szCs w:val="26"/>
-              </w:rPr>
-              <w:t>Lưu trữ mã băm SHA-256 mật khẩu Admin (bảo mật).</w:t>
+              <w:t>Lưu trữ Firebase API Key và Service Account (Private Key, Project ID, Client Email...). Được Git Ignored để bảo mật tuyệt đối.</w:t>
+            </w:r>
+          </w:p>
+        </w:tc>
+      </w:tr>
+      <w:tr>
+        <w:trPr>
+          <w:cnfStyle w:val="000000010000" w:firstRow="0" w:lastRow="0" w:firstColumn="0" w:lastColumn="0" w:oddVBand="0" w:evenVBand="0" w:oddHBand="0" w:evenHBand="1" w:firstRowFirstColumn="0" w:firstRowLastColumn="0" w:lastRowFirstColumn="0" w:lastRowLastColumn="0"/>
+          <w:jc w:val="center"/>
+        </w:trPr>
+        <w:tc>
+          <w:tcPr>
+            <w:cnfStyle w:val="001000000000" w:firstRow="0" w:lastRow="0" w:firstColumn="1" w:lastColumn="0" w:oddVBand="0" w:evenVBand="0" w:oddHBand="0" w:evenHBand="0" w:firstRowFirstColumn="0" w:firstRowLastColumn="0" w:lastRowFirstColumn="0" w:lastRowLastColumn="0"/>
+            <w:tcW w:w="4320" w:type="dxa"/>
+          </w:tcPr>
+          <w:p>
+            <w:r>
+              <w:t>utils/firebase_client.py</w:t>
+            </w:r>
+          </w:p>
+        </w:tc>
+        <w:tc>
+          <w:tcPr>
+            <w:tcW w:w="4320" w:type="dxa"/>
+          </w:tcPr>
+          <w:p>
+            <w:pPr>
+              <w:cnfStyle w:val="000000010000" w:firstRow="0" w:lastRow="0" w:firstColumn="0" w:lastColumn="0" w:oddVBand="0" w:evenVBand="0" w:oddHBand="0" w:evenHBand="1" w:firstRowFirstColumn="0" w:firstRowLastColumn="0" w:lastRowFirstColumn="0" w:lastRowLastColumn="0"/>
+            </w:pPr>
+            <w:r>
+              <w:t>Module kết nối Firebase: Khởi tạo Firestore Client từ Service Account (st.secrets), cung cấp các hàm CRUD dữ liệu Cloud (get/set config), xác thực Admin qua Firebase Auth REST API, và ghi nhật ký sử dụng/dự đoán lên Cloud.</w:t>
             </w:r>
           </w:p>
         </w:tc>

</xml_diff>